<commit_message>
Revise Chapter 1: respectful on-ramp for readers coming from the sovereign-citizen movement
Co-Authored-By: Claude Sonnet 5.5 <noreply@anthropic.com>
Claude-Session: https://claude.ai/code/session_01NYr1whHsh4zv9SMBL3ktf5
</commit_message>
<xml_diff>
--- a/book/revised-front-matter-outline-chapter1.docx
+++ b/book/revised-front-matter-outline-chapter1.docx
@@ -1372,16 +1372,16 @@
     </w:p>
     <w:bookmarkEnd w:id="26"/>
     <w:bookmarkEnd w:id="27"/>
-    <w:bookmarkStart w:id="35" w:name="chapter-1-rewritten"/>
+    <w:bookmarkStart w:id="36" w:name="chapter-1-revised-version-2"/>
     <w:p>
       <w:pPr>
         <w:pStyle w:val="Heading1"/>
       </w:pPr>
       <w:r>
-        <w:t xml:space="preserve">Chapter 1 (Rewritten)</w:t>
-      </w:r>
-    </w:p>
-    <w:bookmarkStart w:id="34" w:name="chapter-1-where-the-idea-came-from"/>
+        <w:t xml:space="preserve">Chapter 1 (Revised, Version 2)</w:t>
+      </w:r>
+    </w:p>
+    <w:bookmarkStart w:id="35" w:name="chapter-1-where-the-idea-came-from"/>
     <w:p>
       <w:pPr>
         <w:pStyle w:val="Heading2"/>
@@ -1395,7 +1395,7 @@
         <w:pStyle w:val="FirstParagraph"/>
       </w:pPr>
       <w:r>
-        <w:t xml:space="preserve">Most people who go looking for the</w:t>
+        <w:t xml:space="preserve">If you picked up this book because you’ve been reading about the</w:t>
       </w:r>
       <w:r>
         <w:t xml:space="preserve"> </w:t>
@@ -1404,7 +1404,7 @@
         <w:t xml:space="preserve">“</w:t>
       </w:r>
       <w:r>
-        <w:t xml:space="preserve">legal strawman</w:t>
+        <w:t xml:space="preserve">legal strawman,</w:t>
       </w:r>
       <w:r>
         <w:t xml:space="preserve">”</w:t>
@@ -1413,7 +1413,17 @@
         <w:t xml:space="preserve"> </w:t>
       </w:r>
       <w:r>
-        <w:t xml:space="preserve">aren’t looking for trouble. They’re looking for an explanation.</w:t>
+        <w:t xml:space="preserve">I want to start by saying something most people never say to you:</w:t>
+      </w:r>
+      <w:r>
+        <w:t xml:space="preserve"> </w:t>
+      </w:r>
+      <w:r>
+        <w:rPr>
+          <w:bCs/>
+          <w:b/>
+        </w:rPr>
+        <w:t xml:space="preserve">your questions are fair.</w:t>
       </w:r>
     </w:p>
     <w:p>
@@ -1421,7 +1431,7 @@
         <w:pStyle w:val="BodyText"/>
       </w:pPr>
       <w:r>
-        <w:t xml:space="preserve">Why is my name printed in capital letters on my court papers? Why does a bank treat me like an account number? Why does it feel as though the people who handle money, property, and the law know a set of rules the rest of us were never taught?</w:t>
+        <w:t xml:space="preserve">Why is your name printed in capital letters on court papers? Why does a bank treat you like an account number? Why does it feel as though the people who handle money, property, and law know a set of rules the rest of us were never taught?</w:t>
       </w:r>
     </w:p>
     <w:p>
@@ -1429,16 +1439,24 @@
         <w:pStyle w:val="BodyText"/>
       </w:pPr>
       <w:r>
-        <w:t xml:space="preserve">Those are fair questions. This book is about the real answers, and about what you can do with them.</w:t>
-      </w:r>
-    </w:p>
-    <w:bookmarkStart w:id="28" w:name="the-myth"/>
+        <w:t xml:space="preserve">Those questions are not foolish. Millions of people have asked them. Most of those people were never given a straight answer. They were laughed at, or they were handed a theory.</w:t>
+      </w:r>
+    </w:p>
+    <w:p>
+      <w:pPr>
+        <w:pStyle w:val="BodyText"/>
+      </w:pPr>
+      <w:r>
+        <w:t xml:space="preserve">This book gives you the straight answer. Part of it will confirm something you suspected. Part of it will tell you that something you were taught is not true. I’m going to be clear about which is which, because your time, your money, and possibly your freedom depend on it.</w:t>
+      </w:r>
+    </w:p>
+    <w:bookmarkStart w:id="28" w:name="what-you-noticed-that-is-real"/>
     <w:p>
       <w:pPr>
         <w:pStyle w:val="Heading3"/>
       </w:pPr>
       <w:r>
-        <w:t xml:space="preserve">The myth</w:t>
+        <w:t xml:space="preserve">What you noticed that is real</w:t>
       </w:r>
     </w:p>
     <w:p>
@@ -1446,113 +1464,7 @@
         <w:pStyle w:val="FirstParagraph"/>
       </w:pPr>
       <w:r>
-        <w:t xml:space="preserve">The</w:t>
-      </w:r>
-      <w:r>
-        <w:t xml:space="preserve"> </w:t>
-      </w:r>
-      <w:r>
-        <w:t xml:space="preserve">“</w:t>
-      </w:r>
-      <w:r>
-        <w:t xml:space="preserve">strawman theory</w:t>
-      </w:r>
-      <w:r>
-        <w:t xml:space="preserve">”</w:t>
-      </w:r>
-      <w:r>
-        <w:t xml:space="preserve"> </w:t>
-      </w:r>
-      <w:r>
-        <w:t xml:space="preserve">says that when you are born, the government secretly creates a second, corporate version of you, tied to your birth certificate and backed by a hidden pot of money. If you can only</w:t>
-      </w:r>
-      <w:r>
-        <w:t xml:space="preserve"> </w:t>
-      </w:r>
-      <w:r>
-        <w:t xml:space="preserve">“</w:t>
-      </w:r>
-      <w:r>
-        <w:t xml:space="preserve">separate</w:t>
-      </w:r>
-      <w:r>
-        <w:t xml:space="preserve">”</w:t>
-      </w:r>
-      <w:r>
-        <w:t xml:space="preserve"> </w:t>
-      </w:r>
-      <w:r>
-        <w:t xml:space="preserve">from it,</w:t>
-      </w:r>
-      <w:r>
-        <w:t xml:space="preserve"> </w:t>
-      </w:r>
-      <w:r>
-        <w:t xml:space="preserve">“</w:t>
-      </w:r>
-      <w:r>
-        <w:t xml:space="preserve">reclaim</w:t>
-      </w:r>
-      <w:r>
-        <w:t xml:space="preserve">”</w:t>
-      </w:r>
-      <w:r>
-        <w:t xml:space="preserve"> </w:t>
-      </w:r>
-      <w:r>
-        <w:t xml:space="preserve">it, or file the right paperwork, the theory claims, you can escape taxes, debts, and court authority.</w:t>
-      </w:r>
-    </w:p>
-    <w:p>
-      <w:pPr>
-        <w:pStyle w:val="BodyText"/>
-      </w:pPr>
-      <w:r>
-        <w:t xml:space="preserve">It is false. No such entity exists. No hidden accounts exist. And people who act on the theory (filing</w:t>
-      </w:r>
-      <w:r>
-        <w:t xml:space="preserve"> </w:t>
-      </w:r>
-      <w:r>
-        <w:t xml:space="preserve">“</w:t>
-      </w:r>
-      <w:r>
-        <w:t xml:space="preserve">redemption</w:t>
-      </w:r>
-      <w:r>
-        <w:t xml:space="preserve">”</w:t>
-      </w:r>
-      <w:r>
-        <w:t xml:space="preserve"> </w:t>
-      </w:r>
-      <w:r>
-        <w:t xml:space="preserve">paperwork, mailing false liens to public officials, or refusing to pay taxes) have ended up with fines, criminal charges, lost homes, and in some cases prison sentences. Courts around the world have rejected these arguments again and again. I want to be plain about that from the first page.</w:t>
-      </w:r>
-    </w:p>
-    <w:p>
-      <w:pPr>
-        <w:pStyle w:val="BodyText"/>
-      </w:pPr>
-      <w:r>
-        <w:t xml:space="preserve">It is also worth knowing where the theory comes from. It grew out of the Posse Comitatus and tax-protester movements of the 1970s and 1980s, which were tied to extremist ideologies, and law-enforcement agencies today treat violent sovereign-citizen extremists as a real security concern. The people who drift into it today are mostly not extremists. Many are frustrated, in debt, or distrustful of institutions that have, at times, treated them badly. But the theory itself is not a harmless misunderstanding. It is a trap.</w:t>
-      </w:r>
-    </w:p>
-    <w:bookmarkEnd w:id="28"/>
-    <w:bookmarkStart w:id="29" w:name="the-real-idea-inside-the-myth"/>
-    <w:p>
-      <w:pPr>
-        <w:pStyle w:val="Heading3"/>
-      </w:pPr>
-      <w:r>
-        <w:t xml:space="preserve">The real idea inside the myth</w:t>
-      </w:r>
-    </w:p>
-    <w:p>
-      <w:pPr>
-        <w:pStyle w:val="FirstParagraph"/>
-      </w:pPr>
-      <w:r>
-        <w:t xml:space="preserve">Here is what makes the theory feel convincing: parts of it point at real law.</w:t>
+        <w:t xml:space="preserve">Many people who start down the strawman path noticed things that are true:</w:t>
       </w:r>
     </w:p>
     <w:p>
@@ -1564,7 +1476,7 @@
         <w:pStyle w:val="Compact"/>
       </w:pPr>
       <w:r>
-        <w:t xml:space="preserve">The law really does recognize more than one kind of</w:t>
+        <w:t xml:space="preserve">The law recognizes more than one kind of</w:t>
       </w:r>
       <w:r>
         <w:t xml:space="preserve"> </w:t>
@@ -1626,7 +1538,7 @@
         <w:pStyle w:val="Compact"/>
       </w:pPr>
       <w:r>
-        <w:t xml:space="preserve">Entities really do carry their own obligations, separate from their owners,</w:t>
+        <w:t xml:space="preserve">Legal persons can carry their own obligations, separate from their owners,</w:t>
       </w:r>
       <w:r>
         <w:t xml:space="preserve"> </w:t>
@@ -1648,7 +1560,7 @@
         <w:pStyle w:val="Compact"/>
       </w:pPr>
       <w:r>
-        <w:t xml:space="preserve">Different documents really are signed in different</w:t>
+        <w:t xml:space="preserve">Documents really are signed in different</w:t>
       </w:r>
       <w:r>
         <w:t xml:space="preserve"> </w:t>
@@ -1661,7 +1573,7 @@
         <w:t xml:space="preserve">capacities</w:t>
       </w:r>
       <w:r>
-        <w:t xml:space="preserve">: as an individual, as a manager of an LLC, or as a trustee of a trust.</w:t>
+        <w:t xml:space="preserve">: as an individual, as the manager of an LLC, or as the trustee of a trust.</w:t>
       </w:r>
     </w:p>
     <w:p>
@@ -1694,10 +1606,536 @@
     </w:p>
     <w:p>
       <w:pPr>
+        <w:numPr>
+          <w:ilvl w:val="0"/>
+          <w:numId w:val="1006"/>
+        </w:numPr>
+        <w:pStyle w:val="Compact"/>
+      </w:pPr>
+      <w:r>
+        <w:t xml:space="preserve">Trusts really can hold property, and they can continue beyond a person’s lifetime.</w:t>
+      </w:r>
+    </w:p>
+    <w:p>
+      <w:pPr>
         <w:pStyle w:val="FirstParagraph"/>
       </w:pPr>
       <w:r>
-        <w:t xml:space="preserve">None of that is secret. It’s the everyday machinery of business law and estate planning, used by small-business owners, landlords, and families every day. What the myth gets wrong is the</w:t>
+        <w:t xml:space="preserve">None of this is secret. It is the everyday machinery of business and estate law. But most people are never taught it, and you were right to sense there was something there.</w:t>
+      </w:r>
+    </w:p>
+    <w:bookmarkEnd w:id="28"/>
+    <w:bookmarkStart w:id="29" w:name="what-you-were-told-that-is-not-true"/>
+    <w:p>
+      <w:pPr>
+        <w:pStyle w:val="Heading3"/>
+      </w:pPr>
+      <w:r>
+        <w:t xml:space="preserve">What you were told that is not true</w:t>
+      </w:r>
+    </w:p>
+    <w:p>
+      <w:pPr>
+        <w:pStyle w:val="FirstParagraph"/>
+      </w:pPr>
+      <w:r>
+        <w:t xml:space="preserve">This is the hard part, and I’d rather say it plainly.</w:t>
+      </w:r>
+    </w:p>
+    <w:p>
+      <w:pPr>
+        <w:pStyle w:val="BodyText"/>
+      </w:pPr>
+      <w:r>
+        <w:t xml:space="preserve">The strawman theory says that when you were born, the government secretly created a corporate double of you, tied to your birth certificate and backed by a hidden account, and that if you file the right paperwork you can</w:t>
+      </w:r>
+      <w:r>
+        <w:t xml:space="preserve"> </w:t>
+      </w:r>
+      <w:r>
+        <w:t xml:space="preserve">“</w:t>
+      </w:r>
+      <w:r>
+        <w:t xml:space="preserve">redeem</w:t>
+      </w:r>
+      <w:r>
+        <w:t xml:space="preserve">”</w:t>
+      </w:r>
+      <w:r>
+        <w:t xml:space="preserve"> </w:t>
+      </w:r>
+      <w:r>
+        <w:t xml:space="preserve">it, separate from it, or opt out of the law.</w:t>
+      </w:r>
+      <w:r>
+        <w:t xml:space="preserve"> </w:t>
+      </w:r>
+      <w:r>
+        <w:rPr>
+          <w:bCs/>
+          <w:b/>
+        </w:rPr>
+        <w:t xml:space="preserve">That is false.</w:t>
+      </w:r>
+      <w:r>
+        <w:t xml:space="preserve"> </w:t>
+      </w:r>
+      <w:r>
+        <w:t xml:space="preserve">No such entity exists. No such account exists. The following claims have been tried in courts for decades and have failed every time:</w:t>
+      </w:r>
+    </w:p>
+    <w:tbl>
+      <w:tblPr>
+        <w:tblStyle w:val="Table"/>
+        <w:tblW w:type="pct" w:w="5000"/>
+        <w:tblLook w:firstRow="1" w:lastRow="0" w:firstColumn="0" w:lastColumn="0" w:noHBand="0" w:noVBand="0" w:val="0020"/>
+        <w:jc w:val="start"/>
+      </w:tblPr>
+      <w:tblGrid>
+        <w:gridCol w:w="3960"/>
+        <w:gridCol w:w="3960"/>
+      </w:tblGrid>
+      <w:tr>
+        <w:trPr>
+          <w:tblHeader w:val="true"/>
+        </w:trPr>
+        <w:tc>
+          <w:tcPr/>
+          <w:p>
+            <w:pPr>
+              <w:pStyle w:val="Compact"/>
+              <w:jc w:val="left"/>
+            </w:pPr>
+            <w:r>
+              <w:t xml:space="preserve">What you may have been told</w:t>
+            </w:r>
+          </w:p>
+        </w:tc>
+        <w:tc>
+          <w:tcPr/>
+          <w:p>
+            <w:pPr>
+              <w:pStyle w:val="Compact"/>
+              <w:jc w:val="left"/>
+            </w:pPr>
+            <w:r>
+              <w:t xml:space="preserve">What actually happens</w:t>
+            </w:r>
+          </w:p>
+        </w:tc>
+      </w:tr>
+      <w:tr>
+        <w:tc>
+          <w:tcPr/>
+          <w:p>
+            <w:pPr>
+              <w:pStyle w:val="Compact"/>
+              <w:jc w:val="left"/>
+            </w:pPr>
+            <w:r>
+              <w:t xml:space="preserve">Your birth certificate created a trust or account you can claim.</w:t>
+            </w:r>
+          </w:p>
+        </w:tc>
+        <w:tc>
+          <w:tcPr/>
+          <w:p>
+            <w:pPr>
+              <w:pStyle w:val="Compact"/>
+              <w:jc w:val="left"/>
+            </w:pPr>
+            <w:r>
+              <w:t xml:space="preserve">No such account exists. Filing to</w:t>
+            </w:r>
+            <w:r>
+              <w:t xml:space="preserve"> </w:t>
+            </w:r>
+            <w:r>
+              <w:t xml:space="preserve">“</w:t>
+            </w:r>
+            <w:r>
+              <w:t xml:space="preserve">claim</w:t>
+            </w:r>
+            <w:r>
+              <w:t xml:space="preserve">”</w:t>
+            </w:r>
+            <w:r>
+              <w:t xml:space="preserve"> </w:t>
+            </w:r>
+            <w:r>
+              <w:t xml:space="preserve">it has no legal effect, and false filings can be crimes.</w:t>
+            </w:r>
+          </w:p>
+        </w:tc>
+      </w:tr>
+      <w:tr>
+        <w:tc>
+          <w:tcPr/>
+          <w:p>
+            <w:pPr>
+              <w:pStyle w:val="Compact"/>
+              <w:jc w:val="left"/>
+            </w:pPr>
+            <w:r>
+              <w:t xml:space="preserve">ALL-CAPS names show a separate corporate</w:t>
+            </w:r>
+            <w:r>
+              <w:t xml:space="preserve"> </w:t>
+            </w:r>
+            <w:r>
+              <w:t xml:space="preserve">“</w:t>
+            </w:r>
+            <w:r>
+              <w:t xml:space="preserve">you.</w:t>
+            </w:r>
+            <w:r>
+              <w:t xml:space="preserve">”</w:t>
+            </w:r>
+          </w:p>
+        </w:tc>
+        <w:tc>
+          <w:tcPr/>
+          <w:p>
+            <w:pPr>
+              <w:pStyle w:val="Compact"/>
+              <w:jc w:val="left"/>
+            </w:pPr>
+            <w:r>
+              <w:t xml:space="preserve">It’s a formatting convention for databases and records. Courts treat it as meaning nothing.</w:t>
+            </w:r>
+          </w:p>
+        </w:tc>
+      </w:tr>
+      <w:tr>
+        <w:tc>
+          <w:tcPr/>
+          <w:p>
+            <w:pPr>
+              <w:pStyle w:val="Compact"/>
+              <w:jc w:val="left"/>
+            </w:pPr>
+            <w:r>
+              <w:t xml:space="preserve">Special phrases (</w:t>
+            </w:r>
+            <w:r>
+              <w:t xml:space="preserve">“</w:t>
+            </w:r>
+            <w:r>
+              <w:t xml:space="preserve">without prejudice UCC 1-308,</w:t>
+            </w:r>
+            <w:r>
+              <w:t xml:space="preserve">”</w:t>
+            </w:r>
+            <w:r>
+              <w:t xml:space="preserve"> </w:t>
+            </w:r>
+            <w:r>
+              <w:t xml:space="preserve">“</w:t>
+            </w:r>
+            <w:r>
+              <w:t xml:space="preserve">sui juris,</w:t>
+            </w:r>
+            <w:r>
+              <w:t xml:space="preserve">”</w:t>
+            </w:r>
+            <w:r>
+              <w:t xml:space="preserve"> </w:t>
+            </w:r>
+            <w:r>
+              <w:t xml:space="preserve">etc.) remove you from the law or from contracts.</w:t>
+            </w:r>
+          </w:p>
+        </w:tc>
+        <w:tc>
+          <w:tcPr/>
+          <w:p>
+            <w:pPr>
+              <w:pStyle w:val="Compact"/>
+              <w:jc w:val="left"/>
+            </w:pPr>
+            <w:r>
+              <w:t xml:space="preserve">Courts ignore them. They don’t change who is bound by a contract or a statute.</w:t>
+            </w:r>
+          </w:p>
+        </w:tc>
+      </w:tr>
+      <w:tr>
+        <w:tc>
+          <w:tcPr/>
+          <w:p>
+            <w:pPr>
+              <w:pStyle w:val="Compact"/>
+              <w:jc w:val="left"/>
+            </w:pPr>
+            <w:r>
+              <w:t xml:space="preserve">You can refuse taxes or court authority by declaring yourself sovereign.</w:t>
+            </w:r>
+          </w:p>
+        </w:tc>
+        <w:tc>
+          <w:tcPr/>
+          <w:p>
+            <w:pPr>
+              <w:pStyle w:val="Compact"/>
+              <w:jc w:val="left"/>
+            </w:pPr>
+            <w:r>
+              <w:t xml:space="preserve">The IRS and courts reject this. It leads to penalties, liens, and sometimes prosecution.</w:t>
+            </w:r>
+          </w:p>
+        </w:tc>
+      </w:tr>
+      <w:tr>
+        <w:tc>
+          <w:tcPr/>
+          <w:p>
+            <w:pPr>
+              <w:pStyle w:val="Compact"/>
+              <w:jc w:val="left"/>
+            </w:pPr>
+            <w:r>
+              <w:t xml:space="preserve">You can file liens or</w:t>
+            </w:r>
+            <w:r>
+              <w:t xml:space="preserve"> </w:t>
+            </w:r>
+            <w:r>
+              <w:t xml:space="preserve">“</w:t>
+            </w:r>
+            <w:r>
+              <w:t xml:space="preserve">UCC</w:t>
+            </w:r>
+            <w:r>
+              <w:t xml:space="preserve">”</w:t>
+            </w:r>
+            <w:r>
+              <w:t xml:space="preserve"> </w:t>
+            </w:r>
+            <w:r>
+              <w:t xml:space="preserve">paperwork against officials to force them.</w:t>
+            </w:r>
+          </w:p>
+        </w:tc>
+        <w:tc>
+          <w:tcPr/>
+          <w:p>
+            <w:pPr>
+              <w:pStyle w:val="Compact"/>
+              <w:jc w:val="left"/>
+            </w:pPr>
+            <w:r>
+              <w:t xml:space="preserve">These are false-lien and harassment offenses in many states and under federal law.</w:t>
+            </w:r>
+          </w:p>
+        </w:tc>
+      </w:tr>
+      <w:tr>
+        <w:tc>
+          <w:tcPr/>
+          <w:p>
+            <w:pPr>
+              <w:pStyle w:val="Compact"/>
+              <w:jc w:val="left"/>
+            </w:pPr>
+            <w:r>
+              <w:t xml:space="preserve">An LLC or trust makes you exempt from the law.</w:t>
+            </w:r>
+          </w:p>
+        </w:tc>
+        <w:tc>
+          <w:tcPr/>
+          <w:p>
+            <w:pPr>
+              <w:pStyle w:val="Compact"/>
+              <w:jc w:val="left"/>
+            </w:pPr>
+            <w:r>
+              <w:t xml:space="preserve">No legal structure does. They organize ownership and liability. They don’t remove obligations.</w:t>
+            </w:r>
+          </w:p>
+        </w:tc>
+      </w:tr>
+    </w:tbl>
+    <w:p>
+      <w:pPr>
+        <w:pStyle w:val="BodyText"/>
+      </w:pPr>
+      <w:r>
+        <w:t xml:space="preserve">You don’t have to take my word for any of this. Every row above can be checked in a statute, an IRS publication, or a court decision, and Chapter [X] shows you how.</w:t>
+      </w:r>
+      <w:r>
+        <w:t xml:space="preserve"> </w:t>
+      </w:r>
+      <w:r>
+        <w:rPr>
+          <w:bCs/>
+          <w:b/>
+        </w:rPr>
+        <w:t xml:space="preserve">Check me. A claim that can’t be checked shouldn’t be trusted, whether it comes from a seminar or from this book.</w:t>
+      </w:r>
+    </w:p>
+    <w:bookmarkEnd w:id="29"/>
+    <w:bookmarkStart w:id="30" w:name="X967076fd0632a7e103a77692321a28c240ed5c6"/>
+    <w:p>
+      <w:pPr>
+        <w:pStyle w:val="Heading3"/>
+      </w:pPr>
+      <w:r>
+        <w:t xml:space="preserve">Where the theory came from, and who profited</w:t>
+      </w:r>
+    </w:p>
+    <w:p>
+      <w:pPr>
+        <w:pStyle w:val="FirstParagraph"/>
+      </w:pPr>
+      <w:r>
+        <w:t xml:space="preserve">It helps to know where this started. The strawman and</w:t>
+      </w:r>
+      <w:r>
+        <w:t xml:space="preserve"> </w:t>
+      </w:r>
+      <w:r>
+        <w:t xml:space="preserve">“</w:t>
+      </w:r>
+      <w:r>
+        <w:t xml:space="preserve">redemption</w:t>
+      </w:r>
+      <w:r>
+        <w:t xml:space="preserve">”</w:t>
+      </w:r>
+      <w:r>
+        <w:t xml:space="preserve"> </w:t>
+      </w:r>
+      <w:r>
+        <w:t xml:space="preserve">ideas grew out of the tax-protest and Posse Comitatus movements of the 1970s and 80s, which were tied to extremist ideologies. Today many people reach these ideas for ordinary reasons: debt, a bad court experience, distrust of banks. Most of them are not extremists. But the theory has a long record of hurting its believers. I’ve seen it described in court records and news reports, and I want to be honest that it’s one of the main reasons I wrote this book.</w:t>
+      </w:r>
+    </w:p>
+    <w:p>
+      <w:pPr>
+        <w:pStyle w:val="BodyText"/>
+      </w:pPr>
+      <w:r>
+        <w:t xml:space="preserve">There is also a business side. A whole industry has sold</w:t>
+      </w:r>
+      <w:r>
+        <w:t xml:space="preserve"> </w:t>
+      </w:r>
+      <w:r>
+        <w:t xml:space="preserve">“</w:t>
+      </w:r>
+      <w:r>
+        <w:t xml:space="preserve">redemption</w:t>
+      </w:r>
+      <w:r>
+        <w:t xml:space="preserve">”</w:t>
+      </w:r>
+      <w:r>
+        <w:t xml:space="preserve"> </w:t>
+      </w:r>
+      <w:r>
+        <w:t xml:space="preserve">packets,</w:t>
+      </w:r>
+      <w:r>
+        <w:t xml:space="preserve"> </w:t>
+      </w:r>
+      <w:r>
+        <w:t xml:space="preserve">“</w:t>
+      </w:r>
+      <w:r>
+        <w:t xml:space="preserve">strawman account</w:t>
+      </w:r>
+      <w:r>
+        <w:t xml:space="preserve">”</w:t>
+      </w:r>
+      <w:r>
+        <w:t xml:space="preserve"> </w:t>
+      </w:r>
+      <w:r>
+        <w:t xml:space="preserve">seminars, and</w:t>
+      </w:r>
+      <w:r>
+        <w:t xml:space="preserve"> </w:t>
+      </w:r>
+      <w:r>
+        <w:t xml:space="preserve">“</w:t>
+      </w:r>
+      <w:r>
+        <w:t xml:space="preserve">freedom</w:t>
+      </w:r>
+      <w:r>
+        <w:t xml:space="preserve">”</w:t>
+      </w:r>
+      <w:r>
+        <w:t xml:space="preserve"> </w:t>
+      </w:r>
+      <w:r>
+        <w:t xml:space="preserve">kits for decades, often at high prices. If you spent money on one, you were not foolish. You were sold a broken version of something real. The people who profited knew, or should have known, that it wouldn’t hold up in court. You didn’t fail at the strategy. The strategy failed you.</w:t>
+      </w:r>
+    </w:p>
+    <w:bookmarkEnd w:id="30"/>
+    <w:bookmarkStart w:id="31" w:name="the-real-version"/>
+    <w:p>
+      <w:pPr>
+        <w:pStyle w:val="Heading3"/>
+      </w:pPr>
+      <w:r>
+        <w:t xml:space="preserve">The real version</w:t>
+      </w:r>
+    </w:p>
+    <w:p>
+      <w:pPr>
+        <w:pStyle w:val="FirstParagraph"/>
+      </w:pPr>
+      <w:r>
+        <w:t xml:space="preserve">Here is what the myth was gesturing at, with the missing step added:</w:t>
+      </w:r>
+      <w:r>
+        <w:t xml:space="preserve"> </w:t>
+      </w:r>
+      <w:r>
+        <w:rPr>
+          <w:bCs/>
+          <w:b/>
+        </w:rPr>
+        <w:t xml:space="preserve">these structures are not handed to you. You build them, in public, by following the rules.</w:t>
+      </w:r>
+    </w:p>
+    <w:p>
+      <w:pPr>
+        <w:pStyle w:val="BodyText"/>
+      </w:pPr>
+      <w:r>
+        <w:t xml:space="preserve">In this book I use the phrase</w:t>
+      </w:r>
+      <w:r>
+        <w:t xml:space="preserve"> </w:t>
+      </w:r>
+      <w:r>
+        <w:rPr>
+          <w:bCs/>
+          <w:b/>
+        </w:rPr>
+        <w:t xml:space="preserve">“</w:t>
+      </w:r>
+      <w:r>
+        <w:rPr>
+          <w:bCs/>
+          <w:b/>
+        </w:rPr>
+        <w:t xml:space="preserve">Legal Strawman</w:t>
+      </w:r>
+      <w:r>
+        <w:rPr>
+          <w:bCs/>
+          <w:b/>
+        </w:rPr>
+        <w:t xml:space="preserve">”</w:t>
+      </w:r>
+      <w:r>
+        <w:t xml:space="preserve"> </w:t>
+      </w:r>
+      <w:r>
+        <w:t xml:space="preserve">for that real structure: the lawful entities you choose to create, such as an LLC, a trust, and the bank accounts and agreements that go with them. I use the name deliberately, so people searching for the myth can find the lawful alternative. If you prefer a plainer term, call it your</w:t>
       </w:r>
       <w:r>
         <w:t xml:space="preserve"> </w:t>
@@ -1707,74 +2145,18 @@
           <w:iCs/>
           <w:i/>
         </w:rPr>
-        <w:t xml:space="preserve">source</w:t>
-      </w:r>
-      <w:r>
-        <w:t xml:space="preserve">. These tools are not handed to you at birth.</w:t>
-      </w:r>
-      <w:r>
-        <w:t xml:space="preserve"> </w:t>
-      </w:r>
-      <w:r>
-        <w:rPr>
-          <w:bCs/>
-          <w:b/>
-        </w:rPr>
-        <w:t xml:space="preserve">You have to create them yourself, in public, by following the rules.</w:t>
+        <w:t xml:space="preserve">entity structure.</w:t>
+      </w:r>
+      <w:r>
+        <w:t xml:space="preserve"> </w:t>
+      </w:r>
+      <w:r>
+        <w:t xml:space="preserve">It’s the same thing.</w:t>
       </w:r>
     </w:p>
     <w:p>
       <w:pPr>
         <w:pStyle w:val="BodyText"/>
-      </w:pPr>
-      <w:r>
-        <w:t xml:space="preserve">That is what I mean by the</w:t>
-      </w:r>
-      <w:r>
-        <w:t xml:space="preserve"> </w:t>
-      </w:r>
-      <w:r>
-        <w:t xml:space="preserve">“</w:t>
-      </w:r>
-      <w:r>
-        <w:t xml:space="preserve">Legal Strawman</w:t>
-      </w:r>
-      <w:r>
-        <w:t xml:space="preserve">”</w:t>
-      </w:r>
-      <w:r>
-        <w:t xml:space="preserve"> </w:t>
-      </w:r>
-      <w:r>
-        <w:t xml:space="preserve">in this book: not a hidden government entity, but the real structure you choose to build, such as an LLC, a trust, and the accounts and agreements that go with them. I use the phrase deliberately, because people searching for the myth should find the lawful alternative. If you prefer a plainer name, call it your</w:t>
-      </w:r>
-      <w:r>
-        <w:t xml:space="preserve"> </w:t>
-      </w:r>
-      <w:r>
-        <w:rPr>
-          <w:iCs/>
-          <w:i/>
-        </w:rPr>
-        <w:t xml:space="preserve">entity structure</w:t>
-      </w:r>
-      <w:r>
-        <w:t xml:space="preserve">. It’s the same thing.</w:t>
-      </w:r>
-    </w:p>
-    <w:bookmarkEnd w:id="29"/>
-    <w:bookmarkStart w:id="30" w:name="what-this-structure-can-do"/>
-    <w:p>
-      <w:pPr>
-        <w:pStyle w:val="Heading3"/>
-      </w:pPr>
-      <w:r>
-        <w:t xml:space="preserve">What this structure can do</w:t>
-      </w:r>
-    </w:p>
-    <w:p>
-      <w:pPr>
-        <w:pStyle w:val="FirstParagraph"/>
       </w:pPr>
       <w:r>
         <w:t xml:space="preserve">Built and run correctly, a simple structure can help you:</w:t>
@@ -1815,7 +2197,7 @@
           <w:bCs/>
           <w:b/>
         </w:rPr>
-        <w:t xml:space="preserve">Keep business finances organized.</w:t>
+        <w:t xml:space="preserve">Keep your business finances organized.</w:t>
       </w:r>
       <w:r>
         <w:t xml:space="preserve"> </w:t>
@@ -1843,7 +2225,7 @@
         <w:t xml:space="preserve"> </w:t>
       </w:r>
       <w:r>
-        <w:t xml:space="preserve">A revocable trust can help your family avoid probate and name who steps in if you can’t manage your affairs.</w:t>
+        <w:t xml:space="preserve">A revocable trust can help your family avoid probate and name who steps in if you can’t manage your own affairs.</w:t>
       </w:r>
     </w:p>
     <w:p>
@@ -1865,11 +2247,11 @@
         <w:t xml:space="preserve"> </w:t>
       </w:r>
       <w:r>
-        <w:t xml:space="preserve">over time, with the right financing and plenty of patience.</w:t>
-      </w:r>
-    </w:p>
-    <w:bookmarkEnd w:id="30"/>
-    <w:bookmarkStart w:id="31" w:name="what-it-cant-do"/>
+        <w:t xml:space="preserve">over time, with proper financing and patience.</w:t>
+      </w:r>
+    </w:p>
+    <w:bookmarkEnd w:id="31"/>
+    <w:bookmarkStart w:id="32" w:name="what-it-cant-do"/>
     <w:p>
       <w:pPr>
         <w:pStyle w:val="Heading3"/>
@@ -1907,7 +2289,7 @@
         <w:pStyle w:val="Compact"/>
       </w:pPr>
       <w:r>
-        <w:t xml:space="preserve">It does not remove your Social Security number from your tax life. In most one-owner setups, the income is still reported on your personal return.</w:t>
+        <w:t xml:space="preserve">It does not take your Social Security number out of your tax life. In most one-owner setups, the income is still reported on your personal return.</w:t>
       </w:r>
     </w:p>
     <w:p>
@@ -1947,7 +2329,7 @@
         <w:pStyle w:val="Compact"/>
       </w:pPr>
       <w:r>
-        <w:t xml:space="preserve">An LLC does not protect you if you ignore it: mix personal and business money, skip required filings, or sign personal guarantees. In those cases a court can look straight through it.</w:t>
+        <w:t xml:space="preserve">An LLC does not protect you if you ignore it: mix personal and business money, skip required filings, or sign personal guarantees. A court can look straight through it.</w:t>
       </w:r>
     </w:p>
     <w:p>
@@ -1962,14 +2344,14 @@
         <w:t xml:space="preserve">It does not guarantee profit. Real-estate deals can lose money.</w:t>
       </w:r>
     </w:p>
-    <w:bookmarkEnd w:id="31"/>
-    <w:bookmarkStart w:id="32" w:name="how-ill-approach-the-rest-of-this-book"/>
+    <w:bookmarkEnd w:id="32"/>
+    <w:bookmarkStart w:id="33" w:name="how-i-came-to-this"/>
     <w:p>
       <w:pPr>
         <w:pStyle w:val="Heading3"/>
       </w:pPr>
       <w:r>
-        <w:t xml:space="preserve">How I’ll approach the rest of this book</w:t>
+        <w:t xml:space="preserve">How I came to this</w:t>
       </w:r>
     </w:p>
     <w:p>
@@ -1977,7 +2359,7 @@
         <w:pStyle w:val="FirstParagraph"/>
       </w:pPr>
       <w:r>
-        <w:t xml:space="preserve">I came to this subject the way many people do: I could see that there was a real structure behind how money and law worked, and I wanted to understand it. I never believed the strawman myth, but I kept noticing that the structures the myth gestures at (LLCs, trusts, EINs) are real, public, and available to anyone willing to learn them. So I set out to put them together from the actual legal standpoint. [</w:t>
+        <w:t xml:space="preserve">I never believed the strawman myth, but I could see that there was a real structure behind how money and law work, and I wanted to understand it. So I set out to put it together from the actual legal standpoint. [</w:t>
       </w:r>
       <w:r>
         <w:rPr>
@@ -1987,7 +2369,7 @@
         <w:t xml:space="preserve">Edit this paragraph to describe your real experience accurately.</w:t>
       </w:r>
       <w:r>
-        <w:t xml:space="preserve">]</w:t>
+        <w:t xml:space="preserve">] I’m writing this book for the person who has been circling the same questions, and who deserves a clear path instead of a slogan.</w:t>
       </w:r>
     </w:p>
     <w:p>
@@ -1995,45 +2377,11 @@
         <w:pStyle w:val="BodyText"/>
       </w:pPr>
       <w:r>
-        <w:t xml:space="preserve">This book walks through that process step by step: forming your LLC, getting your EIN, opening the right accounts, placing the LLC inside a trust, building credit, and using real estate as the engine. At each step you’ll find the costs, the risks, and the questions to ask a professional. Where a popular idea doesn’t work, I’ll say so.</w:t>
-      </w:r>
-    </w:p>
-    <w:p>
-      <w:pPr>
-        <w:pStyle w:val="BodyText"/>
-      </w:pPr>
-      <w:r>
-        <w:t xml:space="preserve">A note on tone. You may have noticed that I haven’t promised you</w:t>
-      </w:r>
-      <w:r>
-        <w:t xml:space="preserve"> </w:t>
-      </w:r>
-      <w:r>
-        <w:t xml:space="preserve">“</w:t>
-      </w:r>
-      <w:r>
-        <w:t xml:space="preserve">generational sovereignty</w:t>
-      </w:r>
-      <w:r>
-        <w:t xml:space="preserve">”</w:t>
-      </w:r>
-      <w:r>
-        <w:t xml:space="preserve"> </w:t>
-      </w:r>
-      <w:r>
-        <w:t xml:space="preserve">or a secret system. That’s on purpose. What I can offer is something less glamorous and more useful: a clear, lawful way to organize your affairs, a realistic picture of what it takes, and a reminder to have a licensed attorney and CPA check your plan before you sign anything.</w:t>
-      </w:r>
-    </w:p>
-    <w:p>
-      <w:pPr>
-        <w:pStyle w:val="BodyText"/>
-      </w:pPr>
-      <w:r>
-        <w:t xml:space="preserve">Let’s start with the basics.</w:t>
-      </w:r>
-    </w:p>
-    <w:bookmarkEnd w:id="32"/>
-    <w:bookmarkStart w:id="33" w:name="practical-action-your-first-three-steps"/>
+        <w:t xml:space="preserve">Along the way you’ll find costs, risks, and questions to ask a licensed professional. Where a popular idea doesn’t work, I’ll say so. That isn’t to talk you out of your goal. Your goal, which is control over your own life, your finances, and your family’s future, is a good one. It just has to be built on things that hold up.</w:t>
+      </w:r>
+    </w:p>
+    <w:bookmarkEnd w:id="33"/>
+    <w:bookmarkStart w:id="34" w:name="practical-action-your-first-three-steps"/>
     <w:p>
       <w:pPr>
         <w:pStyle w:val="Heading3"/>
@@ -2077,13 +2425,13 @@
           <w:bCs/>
           <w:b/>
         </w:rPr>
-        <w:t xml:space="preserve">List the assumptions you’re carrying.</w:t>
-      </w:r>
-      <w:r>
-        <w:t xml:space="preserve"> </w:t>
-      </w:r>
-      <w:r>
-        <w:t xml:space="preserve">Cross out anything that depends on a secret government account or a special signature. Real structure never does.</w:t>
+        <w:t xml:space="preserve">List the claims you’ve been carrying.</w:t>
+      </w:r>
+      <w:r>
+        <w:t xml:space="preserve"> </w:t>
+      </w:r>
+      <w:r>
+        <w:t xml:space="preserve">Next to each one, write where you learned it and whether you’ve been able to check it in a statute or court decision. Cross out anything that depends on a secret government account or a special phrase.</w:t>
       </w:r>
     </w:p>
     <w:p>
@@ -2105,7 +2453,7 @@
         <w:t xml:space="preserve"> </w:t>
       </w:r>
       <w:r>
-        <w:t xml:space="preserve">One with a business/estate attorney in your state, and one with a CPA. Bring this chapter’s list of</w:t>
+        <w:t xml:space="preserve">One with a business/estate attorney in your state, and one with a CPA. Bring the</w:t>
       </w:r>
       <w:r>
         <w:t xml:space="preserve"> </w:t>
@@ -2123,7 +2471,7 @@
         <w:t xml:space="preserve"> </w:t>
       </w:r>
       <w:r>
-        <w:t xml:space="preserve">and ask them to explain how each applies to you.</w:t>
+        <w:t xml:space="preserve">list and ask how each point applies to you.</w:t>
       </w:r>
     </w:p>
     <w:p>
@@ -2138,9 +2486,9 @@
         <w:t xml:space="preserve">Next, Chapter 2: What Is a Legal Person?</w:t>
       </w:r>
     </w:p>
-    <w:bookmarkEnd w:id="33"/>
     <w:bookmarkEnd w:id="34"/>
     <w:bookmarkEnd w:id="35"/>
+    <w:bookmarkEnd w:id="36"/>
     <w:sectPr/>
   </w:body>
 </w:document>

</xml_diff>